<commit_message>
Certai changes are made
</commit_message>
<xml_diff>
--- a/ICT.docx
+++ b/ICT.docx
@@ -10,19 +10,11 @@
           <w:lang w:val="en-US"/>
         </w:rPr>
       </w:pPr>
-      <w:proofErr w:type="gramStart"/>
-      <w:r>
-        <w:rPr>
-          <w:lang w:val="en-US"/>
-        </w:rPr>
-        <w:t>ICT ,</w:t>
-      </w:r>
-      <w:proofErr w:type="gramEnd"/>
-      <w:r>
-        <w:rPr>
-          <w:lang w:val="en-US"/>
-        </w:rPr>
-        <w:t xml:space="preserve"> PESITM</w:t>
+      <w:r>
+        <w:rPr>
+          <w:lang w:val="en-US"/>
+        </w:rPr>
+        <w:t>ICT , PESITM</w:t>
       </w:r>
     </w:p>
     <w:p>
@@ -57,6 +49,59 @@
         </w:rPr>
         <w:t>Developer Roles and Responsibilities</w:t>
       </w:r>
+      <w:r>
+        <w:rPr>
+          <w:lang w:val="en-US"/>
+        </w:rPr>
+        <w:t xml:space="preserve"> </w:t>
+      </w:r>
+      <w:r>
+        <w:rPr>
+          <w:noProof/>
+          <w:lang w:val="en-US"/>
+        </w:rPr>
+        <w:drawing>
+          <wp:inline distT="0" distB="0" distL="0" distR="0" wp14:anchorId="2382CB07" wp14:editId="6BB38BAE">
+            <wp:extent cx="114300" cy="114300"/>
+            <wp:effectExtent l="0" t="0" r="0" b="0"/>
+            <wp:docPr id="1977667299" name="Graphic 1" descr="Checkmark with solid fill"/>
+            <wp:cNvGraphicFramePr>
+              <a:graphicFrameLocks xmlns:a="http://schemas.openxmlformats.org/drawingml/2006/main" noChangeAspect="1"/>
+            </wp:cNvGraphicFramePr>
+            <a:graphic xmlns:a="http://schemas.openxmlformats.org/drawingml/2006/main">
+              <a:graphicData uri="http://schemas.openxmlformats.org/drawingml/2006/picture">
+                <pic:pic xmlns:pic="http://schemas.openxmlformats.org/drawingml/2006/picture">
+                  <pic:nvPicPr>
+                    <pic:cNvPr id="169141003" name="Graphic 169141003" descr="Checkmark with solid fill"/>
+                    <pic:cNvPicPr/>
+                  </pic:nvPicPr>
+                  <pic:blipFill>
+                    <a:blip r:embed="rId7">
+                      <a:extLst>
+                        <a:ext uri="{96DAC541-7B7A-43D3-8B79-37D633B846F1}">
+                          <asvg:svgBlip xmlns:asvg="http://schemas.microsoft.com/office/drawing/2016/SVG/main" r:embed="rId8"/>
+                        </a:ext>
+                      </a:extLst>
+                    </a:blip>
+                    <a:stretch>
+                      <a:fillRect/>
+                    </a:stretch>
+                  </pic:blipFill>
+                  <pic:spPr>
+                    <a:xfrm>
+                      <a:off x="0" y="0"/>
+                      <a:ext cx="114300" cy="114300"/>
+                    </a:xfrm>
+                    <a:prstGeom prst="rect">
+                      <a:avLst/>
+                    </a:prstGeom>
+                  </pic:spPr>
+                </pic:pic>
+              </a:graphicData>
+            </a:graphic>
+          </wp:inline>
+        </w:drawing>
+      </w:r>
     </w:p>
     <w:p>
       <w:pPr>
@@ -75,6 +120,59 @@
         </w:rPr>
         <w:t>Language and Applications</w:t>
       </w:r>
+      <w:r>
+        <w:rPr>
+          <w:lang w:val="en-US"/>
+        </w:rPr>
+        <w:t xml:space="preserve"> </w:t>
+      </w:r>
+      <w:r>
+        <w:rPr>
+          <w:noProof/>
+          <w:lang w:val="en-US"/>
+        </w:rPr>
+        <w:drawing>
+          <wp:inline distT="0" distB="0" distL="0" distR="0" wp14:anchorId="0D0AB80B" wp14:editId="6F433271">
+            <wp:extent cx="114300" cy="114300"/>
+            <wp:effectExtent l="0" t="0" r="0" b="0"/>
+            <wp:docPr id="568551891" name="Graphic 1" descr="Checkmark with solid fill"/>
+            <wp:cNvGraphicFramePr>
+              <a:graphicFrameLocks xmlns:a="http://schemas.openxmlformats.org/drawingml/2006/main" noChangeAspect="1"/>
+            </wp:cNvGraphicFramePr>
+            <a:graphic xmlns:a="http://schemas.openxmlformats.org/drawingml/2006/main">
+              <a:graphicData uri="http://schemas.openxmlformats.org/drawingml/2006/picture">
+                <pic:pic xmlns:pic="http://schemas.openxmlformats.org/drawingml/2006/picture">
+                  <pic:nvPicPr>
+                    <pic:cNvPr id="169141003" name="Graphic 169141003" descr="Checkmark with solid fill"/>
+                    <pic:cNvPicPr/>
+                  </pic:nvPicPr>
+                  <pic:blipFill>
+                    <a:blip r:embed="rId7">
+                      <a:extLst>
+                        <a:ext uri="{96DAC541-7B7A-43D3-8B79-37D633B846F1}">
+                          <asvg:svgBlip xmlns:asvg="http://schemas.microsoft.com/office/drawing/2016/SVG/main" r:embed="rId8"/>
+                        </a:ext>
+                      </a:extLst>
+                    </a:blip>
+                    <a:stretch>
+                      <a:fillRect/>
+                    </a:stretch>
+                  </pic:blipFill>
+                  <pic:spPr>
+                    <a:xfrm>
+                      <a:off x="0" y="0"/>
+                      <a:ext cx="114300" cy="114300"/>
+                    </a:xfrm>
+                    <a:prstGeom prst="rect">
+                      <a:avLst/>
+                    </a:prstGeom>
+                  </pic:spPr>
+                </pic:pic>
+              </a:graphicData>
+            </a:graphic>
+          </wp:inline>
+        </w:drawing>
+      </w:r>
     </w:p>
     <w:p>
       <w:pPr>
@@ -93,6 +191,59 @@
         </w:rPr>
         <w:t>3 tier Architecture</w:t>
       </w:r>
+      <w:r>
+        <w:rPr>
+          <w:lang w:val="en-US"/>
+        </w:rPr>
+        <w:t xml:space="preserve"> </w:t>
+      </w:r>
+      <w:r>
+        <w:rPr>
+          <w:noProof/>
+          <w:lang w:val="en-US"/>
+        </w:rPr>
+        <w:drawing>
+          <wp:inline distT="0" distB="0" distL="0" distR="0" wp14:anchorId="51EDD9A9" wp14:editId="2CC41079">
+            <wp:extent cx="114300" cy="114300"/>
+            <wp:effectExtent l="0" t="0" r="0" b="0"/>
+            <wp:docPr id="540240734" name="Graphic 1" descr="Checkmark with solid fill"/>
+            <wp:cNvGraphicFramePr>
+              <a:graphicFrameLocks xmlns:a="http://schemas.openxmlformats.org/drawingml/2006/main" noChangeAspect="1"/>
+            </wp:cNvGraphicFramePr>
+            <a:graphic xmlns:a="http://schemas.openxmlformats.org/drawingml/2006/main">
+              <a:graphicData uri="http://schemas.openxmlformats.org/drawingml/2006/picture">
+                <pic:pic xmlns:pic="http://schemas.openxmlformats.org/drawingml/2006/picture">
+                  <pic:nvPicPr>
+                    <pic:cNvPr id="169141003" name="Graphic 169141003" descr="Checkmark with solid fill"/>
+                    <pic:cNvPicPr/>
+                  </pic:nvPicPr>
+                  <pic:blipFill>
+                    <a:blip r:embed="rId7">
+                      <a:extLst>
+                        <a:ext uri="{96DAC541-7B7A-43D3-8B79-37D633B846F1}">
+                          <asvg:svgBlip xmlns:asvg="http://schemas.microsoft.com/office/drawing/2016/SVG/main" r:embed="rId8"/>
+                        </a:ext>
+                      </a:extLst>
+                    </a:blip>
+                    <a:stretch>
+                      <a:fillRect/>
+                    </a:stretch>
+                  </pic:blipFill>
+                  <pic:spPr>
+                    <a:xfrm>
+                      <a:off x="0" y="0"/>
+                      <a:ext cx="114300" cy="114300"/>
+                    </a:xfrm>
+                    <a:prstGeom prst="rect">
+                      <a:avLst/>
+                    </a:prstGeom>
+                  </pic:spPr>
+                </pic:pic>
+              </a:graphicData>
+            </a:graphic>
+          </wp:inline>
+        </w:drawing>
+      </w:r>
     </w:p>
     <w:p>
       <w:pPr>
@@ -111,6 +262,52 @@
         </w:rPr>
         <w:t xml:space="preserve">Popular tech Stacks </w:t>
       </w:r>
+      <w:r>
+        <w:rPr>
+          <w:lang w:val="en-US"/>
+        </w:rPr>
+        <w:t xml:space="preserve"> </w:t>
+      </w:r>
+      <w:r>
+        <w:rPr>
+          <w:noProof/>
+        </w:rPr>
+        <w:drawing>
+          <wp:inline distT="0" distB="0" distL="0" distR="0" wp14:anchorId="708C3892" wp14:editId="4E633B7D">
+            <wp:extent cx="114286" cy="114286"/>
+            <wp:effectExtent l="0" t="0" r="635" b="635"/>
+            <wp:docPr id="423350125" name="Picture 1"/>
+            <wp:cNvGraphicFramePr>
+              <a:graphicFrameLocks xmlns:a="http://schemas.openxmlformats.org/drawingml/2006/main" noChangeAspect="1"/>
+            </wp:cNvGraphicFramePr>
+            <a:graphic xmlns:a="http://schemas.openxmlformats.org/drawingml/2006/main">
+              <a:graphicData uri="http://schemas.openxmlformats.org/drawingml/2006/picture">
+                <pic:pic xmlns:pic="http://schemas.openxmlformats.org/drawingml/2006/picture">
+                  <pic:nvPicPr>
+                    <pic:cNvPr id="423350125" name=""/>
+                    <pic:cNvPicPr/>
+                  </pic:nvPicPr>
+                  <pic:blipFill>
+                    <a:blip r:embed="rId9"/>
+                    <a:stretch>
+                      <a:fillRect/>
+                    </a:stretch>
+                  </pic:blipFill>
+                  <pic:spPr>
+                    <a:xfrm>
+                      <a:off x="0" y="0"/>
+                      <a:ext cx="114286" cy="114286"/>
+                    </a:xfrm>
+                    <a:prstGeom prst="rect">
+                      <a:avLst/>
+                    </a:prstGeom>
+                  </pic:spPr>
+                </pic:pic>
+              </a:graphicData>
+            </a:graphic>
+          </wp:inline>
+        </w:drawing>
+      </w:r>
     </w:p>
     <w:p>
       <w:pPr>
@@ -127,21 +324,53 @@
         <w:rPr>
           <w:lang w:val="en-US"/>
         </w:rPr>
-        <w:t xml:space="preserve">Java Full stack (Java, Hibernate, JPA, Spring, </w:t>
-      </w:r>
-      <w:proofErr w:type="spellStart"/>
-      <w:r>
-        <w:rPr>
-          <w:lang w:val="en-US"/>
-        </w:rPr>
-        <w:t>SpringBoot</w:t>
-      </w:r>
-      <w:proofErr w:type="spellEnd"/>
-      <w:r>
-        <w:rPr>
-          <w:lang w:val="en-US"/>
-        </w:rPr>
-        <w:t>, HTML5, CSS3, JavaScript)</w:t>
+        <w:t>Java Full stack (Java, Hibernate, JPA, Spring, SpringBoot, HTML5, CSS3, JavaScript)</w:t>
+      </w:r>
+      <w:r>
+        <w:rPr>
+          <w:lang w:val="en-US"/>
+        </w:rPr>
+        <w:t xml:space="preserve"> </w:t>
+      </w:r>
+      <w:r>
+        <w:rPr>
+          <w:noProof/>
+        </w:rPr>
+        <w:drawing>
+          <wp:inline distT="0" distB="0" distL="0" distR="0" wp14:anchorId="5E52DF43" wp14:editId="2C4C07D9">
+            <wp:extent cx="114286" cy="114286"/>
+            <wp:effectExtent l="0" t="0" r="635" b="635"/>
+            <wp:docPr id="157182009" name="Picture 1"/>
+            <wp:cNvGraphicFramePr>
+              <a:graphicFrameLocks xmlns:a="http://schemas.openxmlformats.org/drawingml/2006/main" noChangeAspect="1"/>
+            </wp:cNvGraphicFramePr>
+            <a:graphic xmlns:a="http://schemas.openxmlformats.org/drawingml/2006/main">
+              <a:graphicData uri="http://schemas.openxmlformats.org/drawingml/2006/picture">
+                <pic:pic xmlns:pic="http://schemas.openxmlformats.org/drawingml/2006/picture">
+                  <pic:nvPicPr>
+                    <pic:cNvPr id="157182009" name=""/>
+                    <pic:cNvPicPr/>
+                  </pic:nvPicPr>
+                  <pic:blipFill>
+                    <a:blip r:embed="rId9"/>
+                    <a:stretch>
+                      <a:fillRect/>
+                    </a:stretch>
+                  </pic:blipFill>
+                  <pic:spPr>
+                    <a:xfrm>
+                      <a:off x="0" y="0"/>
+                      <a:ext cx="114286" cy="114286"/>
+                    </a:xfrm>
+                    <a:prstGeom prst="rect">
+                      <a:avLst/>
+                    </a:prstGeom>
+                  </pic:spPr>
+                </pic:pic>
+              </a:graphicData>
+            </a:graphic>
+          </wp:inline>
+        </w:drawing>
       </w:r>
     </w:p>
     <w:p>
@@ -159,21 +388,53 @@
         <w:rPr>
           <w:lang w:val="en-US"/>
         </w:rPr>
-        <w:t xml:space="preserve">MERN </w:t>
-      </w:r>
-      <w:proofErr w:type="gramStart"/>
-      <w:r>
-        <w:rPr>
-          <w:lang w:val="en-US"/>
-        </w:rPr>
-        <w:t>Stack(</w:t>
-      </w:r>
-      <w:proofErr w:type="gramEnd"/>
-      <w:r>
-        <w:rPr>
-          <w:lang w:val="en-US"/>
-        </w:rPr>
-        <w:t>MongoDB, Express.js, React.js, Node).</w:t>
+        <w:t>MERN Stack(MongoDB, Express.js, React.js, Node).</w:t>
+      </w:r>
+      <w:r>
+        <w:rPr>
+          <w:lang w:val="en-US"/>
+        </w:rPr>
+        <w:t xml:space="preserve"> </w:t>
+      </w:r>
+      <w:r>
+        <w:rPr>
+          <w:noProof/>
+        </w:rPr>
+        <w:drawing>
+          <wp:inline distT="0" distB="0" distL="0" distR="0" wp14:anchorId="0729D434" wp14:editId="6ABE7E2B">
+            <wp:extent cx="114286" cy="114286"/>
+            <wp:effectExtent l="0" t="0" r="635" b="635"/>
+            <wp:docPr id="1006792845" name="Picture 1"/>
+            <wp:cNvGraphicFramePr>
+              <a:graphicFrameLocks xmlns:a="http://schemas.openxmlformats.org/drawingml/2006/main" noChangeAspect="1"/>
+            </wp:cNvGraphicFramePr>
+            <a:graphic xmlns:a="http://schemas.openxmlformats.org/drawingml/2006/main">
+              <a:graphicData uri="http://schemas.openxmlformats.org/drawingml/2006/picture">
+                <pic:pic xmlns:pic="http://schemas.openxmlformats.org/drawingml/2006/picture">
+                  <pic:nvPicPr>
+                    <pic:cNvPr id="1006792845" name=""/>
+                    <pic:cNvPicPr/>
+                  </pic:nvPicPr>
+                  <pic:blipFill>
+                    <a:blip r:embed="rId9"/>
+                    <a:stretch>
+                      <a:fillRect/>
+                    </a:stretch>
+                  </pic:blipFill>
+                  <pic:spPr>
+                    <a:xfrm>
+                      <a:off x="0" y="0"/>
+                      <a:ext cx="114286" cy="114286"/>
+                    </a:xfrm>
+                    <a:prstGeom prst="rect">
+                      <a:avLst/>
+                    </a:prstGeom>
+                  </pic:spPr>
+                </pic:pic>
+              </a:graphicData>
+            </a:graphic>
+          </wp:inline>
+        </w:drawing>
       </w:r>
     </w:p>
     <w:p>
@@ -191,21 +452,53 @@
         <w:rPr>
           <w:lang w:val="en-US"/>
         </w:rPr>
-        <w:t xml:space="preserve">MEAN </w:t>
-      </w:r>
-      <w:proofErr w:type="gramStart"/>
-      <w:r>
-        <w:rPr>
-          <w:lang w:val="en-US"/>
-        </w:rPr>
-        <w:t>Stack(</w:t>
-      </w:r>
-      <w:proofErr w:type="gramEnd"/>
-      <w:r>
-        <w:rPr>
-          <w:lang w:val="en-US"/>
-        </w:rPr>
-        <w:t>MongoDB, Express.js, Angular.js, Node).</w:t>
+        <w:t>MEAN Stack(MongoDB, Express.js, Angular.js, Node).</w:t>
+      </w:r>
+      <w:r>
+        <w:rPr>
+          <w:lang w:val="en-US"/>
+        </w:rPr>
+        <w:t xml:space="preserve"> </w:t>
+      </w:r>
+      <w:r>
+        <w:rPr>
+          <w:noProof/>
+        </w:rPr>
+        <w:drawing>
+          <wp:inline distT="0" distB="0" distL="0" distR="0" wp14:anchorId="53D48F96" wp14:editId="1C956023">
+            <wp:extent cx="114286" cy="114286"/>
+            <wp:effectExtent l="0" t="0" r="635" b="635"/>
+            <wp:docPr id="1208165685" name="Picture 1"/>
+            <wp:cNvGraphicFramePr>
+              <a:graphicFrameLocks xmlns:a="http://schemas.openxmlformats.org/drawingml/2006/main" noChangeAspect="1"/>
+            </wp:cNvGraphicFramePr>
+            <a:graphic xmlns:a="http://schemas.openxmlformats.org/drawingml/2006/main">
+              <a:graphicData uri="http://schemas.openxmlformats.org/drawingml/2006/picture">
+                <pic:pic xmlns:pic="http://schemas.openxmlformats.org/drawingml/2006/picture">
+                  <pic:nvPicPr>
+                    <pic:cNvPr id="1208165685" name=""/>
+                    <pic:cNvPicPr/>
+                  </pic:nvPicPr>
+                  <pic:blipFill>
+                    <a:blip r:embed="rId9"/>
+                    <a:stretch>
+                      <a:fillRect/>
+                    </a:stretch>
+                  </pic:blipFill>
+                  <pic:spPr>
+                    <a:xfrm>
+                      <a:off x="0" y="0"/>
+                      <a:ext cx="114286" cy="114286"/>
+                    </a:xfrm>
+                    <a:prstGeom prst="rect">
+                      <a:avLst/>
+                    </a:prstGeom>
+                  </pic:spPr>
+                </pic:pic>
+              </a:graphicData>
+            </a:graphic>
+          </wp:inline>
+        </w:drawing>
       </w:r>
     </w:p>
     <w:p>
@@ -225,6 +518,59 @@
         </w:rPr>
         <w:t>Java Features.</w:t>
       </w:r>
+      <w:r>
+        <w:rPr>
+          <w:lang w:val="en-US"/>
+        </w:rPr>
+        <w:t xml:space="preserve"> </w:t>
+      </w:r>
+      <w:r>
+        <w:rPr>
+          <w:noProof/>
+          <w:lang w:val="en-US"/>
+        </w:rPr>
+        <w:drawing>
+          <wp:inline distT="0" distB="0" distL="0" distR="0" wp14:anchorId="1CC830B8" wp14:editId="4701BFB0">
+            <wp:extent cx="114300" cy="114300"/>
+            <wp:effectExtent l="0" t="0" r="0" b="0"/>
+            <wp:docPr id="1301852577" name="Graphic 1" descr="Checkmark with solid fill"/>
+            <wp:cNvGraphicFramePr>
+              <a:graphicFrameLocks xmlns:a="http://schemas.openxmlformats.org/drawingml/2006/main" noChangeAspect="1"/>
+            </wp:cNvGraphicFramePr>
+            <a:graphic xmlns:a="http://schemas.openxmlformats.org/drawingml/2006/main">
+              <a:graphicData uri="http://schemas.openxmlformats.org/drawingml/2006/picture">
+                <pic:pic xmlns:pic="http://schemas.openxmlformats.org/drawingml/2006/picture">
+                  <pic:nvPicPr>
+                    <pic:cNvPr id="169141003" name="Graphic 169141003" descr="Checkmark with solid fill"/>
+                    <pic:cNvPicPr/>
+                  </pic:nvPicPr>
+                  <pic:blipFill>
+                    <a:blip r:embed="rId7">
+                      <a:extLst>
+                        <a:ext uri="{96DAC541-7B7A-43D3-8B79-37D633B846F1}">
+                          <asvg:svgBlip xmlns:asvg="http://schemas.microsoft.com/office/drawing/2016/SVG/main" r:embed="rId8"/>
+                        </a:ext>
+                      </a:extLst>
+                    </a:blip>
+                    <a:stretch>
+                      <a:fillRect/>
+                    </a:stretch>
+                  </pic:blipFill>
+                  <pic:spPr>
+                    <a:xfrm>
+                      <a:off x="0" y="0"/>
+                      <a:ext cx="114300" cy="114300"/>
+                    </a:xfrm>
+                    <a:prstGeom prst="rect">
+                      <a:avLst/>
+                    </a:prstGeom>
+                  </pic:spPr>
+                </pic:pic>
+              </a:graphicData>
+            </a:graphic>
+          </wp:inline>
+        </w:drawing>
+      </w:r>
     </w:p>
     <w:p>
       <w:pPr>
@@ -243,6 +589,59 @@
         </w:rPr>
         <w:t>JDK, JRE, JVM.</w:t>
       </w:r>
+      <w:r>
+        <w:rPr>
+          <w:lang w:val="en-US"/>
+        </w:rPr>
+        <w:t xml:space="preserve"> </w:t>
+      </w:r>
+      <w:r>
+        <w:rPr>
+          <w:noProof/>
+          <w:lang w:val="en-US"/>
+        </w:rPr>
+        <w:drawing>
+          <wp:inline distT="0" distB="0" distL="0" distR="0" wp14:anchorId="04C76E7C" wp14:editId="71E632D5">
+            <wp:extent cx="114300" cy="114300"/>
+            <wp:effectExtent l="0" t="0" r="0" b="0"/>
+            <wp:docPr id="169141003" name="Graphic 1" descr="Checkmark with solid fill"/>
+            <wp:cNvGraphicFramePr>
+              <a:graphicFrameLocks xmlns:a="http://schemas.openxmlformats.org/drawingml/2006/main" noChangeAspect="1"/>
+            </wp:cNvGraphicFramePr>
+            <a:graphic xmlns:a="http://schemas.openxmlformats.org/drawingml/2006/main">
+              <a:graphicData uri="http://schemas.openxmlformats.org/drawingml/2006/picture">
+                <pic:pic xmlns:pic="http://schemas.openxmlformats.org/drawingml/2006/picture">
+                  <pic:nvPicPr>
+                    <pic:cNvPr id="169141003" name="Graphic 169141003" descr="Checkmark with solid fill"/>
+                    <pic:cNvPicPr/>
+                  </pic:nvPicPr>
+                  <pic:blipFill>
+                    <a:blip r:embed="rId7">
+                      <a:extLst>
+                        <a:ext uri="{96DAC541-7B7A-43D3-8B79-37D633B846F1}">
+                          <asvg:svgBlip xmlns:asvg="http://schemas.microsoft.com/office/drawing/2016/SVG/main" r:embed="rId8"/>
+                        </a:ext>
+                      </a:extLst>
+                    </a:blip>
+                    <a:stretch>
+                      <a:fillRect/>
+                    </a:stretch>
+                  </pic:blipFill>
+                  <pic:spPr>
+                    <a:xfrm>
+                      <a:off x="0" y="0"/>
+                      <a:ext cx="114300" cy="114300"/>
+                    </a:xfrm>
+                    <a:prstGeom prst="rect">
+                      <a:avLst/>
+                    </a:prstGeom>
+                  </pic:spPr>
+                </pic:pic>
+              </a:graphicData>
+            </a:graphic>
+          </wp:inline>
+        </w:drawing>
+      </w:r>
     </w:p>
     <w:p>
       <w:pPr>
@@ -259,35 +658,53 @@
         <w:rPr>
           <w:lang w:val="en-US"/>
         </w:rPr>
-        <w:t>J2</w:t>
-      </w:r>
-      <w:proofErr w:type="gramStart"/>
-      <w:r>
-        <w:rPr>
-          <w:lang w:val="en-US"/>
-        </w:rPr>
-        <w:t>SE(</w:t>
-      </w:r>
-      <w:proofErr w:type="gramEnd"/>
-      <w:r>
-        <w:rPr>
-          <w:lang w:val="en-US"/>
-        </w:rPr>
-        <w:t>Standard Edition), J2</w:t>
-      </w:r>
-      <w:proofErr w:type="gramStart"/>
-      <w:r>
-        <w:rPr>
-          <w:lang w:val="en-US"/>
-        </w:rPr>
-        <w:t>EE(</w:t>
-      </w:r>
-      <w:proofErr w:type="gramEnd"/>
-      <w:r>
-        <w:rPr>
-          <w:lang w:val="en-US"/>
-        </w:rPr>
-        <w:t>Enterprise Edition).</w:t>
+        <w:t>J2SE(Standard Edition), J2EE(Enterprise Edition).</w:t>
+      </w:r>
+      <w:r>
+        <w:rPr>
+          <w:lang w:val="en-US"/>
+        </w:rPr>
+        <w:t xml:space="preserve"> </w:t>
+      </w:r>
+      <w:r>
+        <w:rPr>
+          <w:noProof/>
+        </w:rPr>
+        <w:drawing>
+          <wp:inline distT="0" distB="0" distL="0" distR="0" wp14:anchorId="70D11A51" wp14:editId="20EB884B">
+            <wp:extent cx="114286" cy="114286"/>
+            <wp:effectExtent l="0" t="0" r="635" b="635"/>
+            <wp:docPr id="2042517815" name="Picture 1"/>
+            <wp:cNvGraphicFramePr>
+              <a:graphicFrameLocks xmlns:a="http://schemas.openxmlformats.org/drawingml/2006/main" noChangeAspect="1"/>
+            </wp:cNvGraphicFramePr>
+            <a:graphic xmlns:a="http://schemas.openxmlformats.org/drawingml/2006/main">
+              <a:graphicData uri="http://schemas.openxmlformats.org/drawingml/2006/picture">
+                <pic:pic xmlns:pic="http://schemas.openxmlformats.org/drawingml/2006/picture">
+                  <pic:nvPicPr>
+                    <pic:cNvPr id="2042517815" name=""/>
+                    <pic:cNvPicPr/>
+                  </pic:nvPicPr>
+                  <pic:blipFill>
+                    <a:blip r:embed="rId9"/>
+                    <a:stretch>
+                      <a:fillRect/>
+                    </a:stretch>
+                  </pic:blipFill>
+                  <pic:spPr>
+                    <a:xfrm>
+                      <a:off x="0" y="0"/>
+                      <a:ext cx="114286" cy="114286"/>
+                    </a:xfrm>
+                    <a:prstGeom prst="rect">
+                      <a:avLst/>
+                    </a:prstGeom>
+                  </pic:spPr>
+                </pic:pic>
+              </a:graphicData>
+            </a:graphic>
+          </wp:inline>
+        </w:drawing>
       </w:r>
     </w:p>
     <w:p>
@@ -307,6 +724,52 @@
         </w:rPr>
         <w:t>Standalone Applications, and Web Applications</w:t>
       </w:r>
+      <w:r>
+        <w:rPr>
+          <w:lang w:val="en-US"/>
+        </w:rPr>
+        <w:t xml:space="preserve"> </w:t>
+      </w:r>
+      <w:r>
+        <w:rPr>
+          <w:noProof/>
+        </w:rPr>
+        <w:drawing>
+          <wp:inline distT="0" distB="0" distL="0" distR="0" wp14:anchorId="5971256B" wp14:editId="64B56AF0">
+            <wp:extent cx="114286" cy="114286"/>
+            <wp:effectExtent l="0" t="0" r="635" b="635"/>
+            <wp:docPr id="222978544" name="Picture 1"/>
+            <wp:cNvGraphicFramePr>
+              <a:graphicFrameLocks xmlns:a="http://schemas.openxmlformats.org/drawingml/2006/main" noChangeAspect="1"/>
+            </wp:cNvGraphicFramePr>
+            <a:graphic xmlns:a="http://schemas.openxmlformats.org/drawingml/2006/main">
+              <a:graphicData uri="http://schemas.openxmlformats.org/drawingml/2006/picture">
+                <pic:pic xmlns:pic="http://schemas.openxmlformats.org/drawingml/2006/picture">
+                  <pic:nvPicPr>
+                    <pic:cNvPr id="222978544" name=""/>
+                    <pic:cNvPicPr/>
+                  </pic:nvPicPr>
+                  <pic:blipFill>
+                    <a:blip r:embed="rId9"/>
+                    <a:stretch>
+                      <a:fillRect/>
+                    </a:stretch>
+                  </pic:blipFill>
+                  <pic:spPr>
+                    <a:xfrm>
+                      <a:off x="0" y="0"/>
+                      <a:ext cx="114286" cy="114286"/>
+                    </a:xfrm>
+                    <a:prstGeom prst="rect">
+                      <a:avLst/>
+                    </a:prstGeom>
+                  </pic:spPr>
+                </pic:pic>
+              </a:graphicData>
+            </a:graphic>
+          </wp:inline>
+        </w:drawing>
+      </w:r>
     </w:p>
     <w:p>
       <w:pPr>
@@ -341,63 +804,7 @@
         <w:rPr>
           <w:lang w:val="en-US"/>
         </w:rPr>
-        <w:t xml:space="preserve">Predefined </w:t>
-      </w:r>
-      <w:proofErr w:type="gramStart"/>
-      <w:r>
-        <w:rPr>
-          <w:lang w:val="en-US"/>
-        </w:rPr>
-        <w:t>Packages(</w:t>
-      </w:r>
-      <w:proofErr w:type="gramEnd"/>
-      <w:r>
-        <w:rPr>
-          <w:lang w:val="en-US"/>
-        </w:rPr>
-        <w:t xml:space="preserve">Java lang, </w:t>
-      </w:r>
-      <w:proofErr w:type="gramStart"/>
-      <w:r>
-        <w:rPr>
-          <w:lang w:val="en-US"/>
-        </w:rPr>
-        <w:t xml:space="preserve">java.in,  </w:t>
-      </w:r>
-      <w:proofErr w:type="spellStart"/>
-      <w:r>
-        <w:rPr>
-          <w:lang w:val="en-US"/>
-        </w:rPr>
-        <w:t>java</w:t>
-      </w:r>
-      <w:proofErr w:type="gramEnd"/>
-      <w:r>
-        <w:rPr>
-          <w:lang w:val="en-US"/>
-        </w:rPr>
-        <w:t>.util</w:t>
-      </w:r>
-      <w:proofErr w:type="spellEnd"/>
-      <w:r>
-        <w:rPr>
-          <w:lang w:val="en-US"/>
-        </w:rPr>
-        <w:t xml:space="preserve">, </w:t>
-      </w:r>
-      <w:proofErr w:type="spellStart"/>
-      <w:r>
-        <w:rPr>
-          <w:lang w:val="en-US"/>
-        </w:rPr>
-        <w:t>java.sql</w:t>
-      </w:r>
-      <w:proofErr w:type="spellEnd"/>
-      <w:r>
-        <w:rPr>
-          <w:lang w:val="en-US"/>
-        </w:rPr>
-        <w:t>)</w:t>
+        <w:t>Predefined Packages(Java lang, java.in,  java.util, java.sql)</w:t>
       </w:r>
     </w:p>
     <w:p>
@@ -411,55 +818,11 @@
           <w:lang w:val="en-US"/>
         </w:rPr>
       </w:pPr>
-      <w:proofErr w:type="spellStart"/>
-      <w:r>
-        <w:rPr>
-          <w:lang w:val="en-US"/>
-        </w:rPr>
-        <w:t>UserDefined</w:t>
-      </w:r>
-      <w:proofErr w:type="spellEnd"/>
-      <w:r>
-        <w:rPr>
-          <w:lang w:val="en-US"/>
-        </w:rPr>
-        <w:t xml:space="preserve"> </w:t>
-      </w:r>
-      <w:proofErr w:type="gramStart"/>
-      <w:r>
-        <w:rPr>
-          <w:lang w:val="en-US"/>
-        </w:rPr>
-        <w:t>Packages(</w:t>
-      </w:r>
-      <w:proofErr w:type="gramEnd"/>
-      <w:r>
-        <w:rPr>
-          <w:lang w:val="en-US"/>
-        </w:rPr>
-        <w:t xml:space="preserve">Package </w:t>
-      </w:r>
-      <w:proofErr w:type="spellStart"/>
-      <w:proofErr w:type="gramStart"/>
-      <w:r>
-        <w:rPr>
-          <w:lang w:val="en-US"/>
-        </w:rPr>
-        <w:t>com.pesitm</w:t>
-      </w:r>
-      <w:proofErr w:type="gramEnd"/>
-      <w:r>
-        <w:rPr>
-          <w:lang w:val="en-US"/>
-        </w:rPr>
-        <w:t>.oops</w:t>
-      </w:r>
-      <w:proofErr w:type="spellEnd"/>
-      <w:r>
-        <w:rPr>
-          <w:lang w:val="en-US"/>
-        </w:rPr>
-        <w:t>)</w:t>
+      <w:r>
+        <w:rPr>
+          <w:lang w:val="en-US"/>
+        </w:rPr>
+        <w:t>UserDefined Packages(Package com.pesitm.oops)</w:t>
       </w:r>
     </w:p>
     <w:p>
@@ -479,6 +842,59 @@
         </w:rPr>
         <w:t>JDK, JRE, JVM</w:t>
       </w:r>
+      <w:r>
+        <w:rPr>
+          <w:lang w:val="en-US"/>
+        </w:rPr>
+        <w:t xml:space="preserve"> </w:t>
+      </w:r>
+      <w:r>
+        <w:rPr>
+          <w:noProof/>
+          <w:lang w:val="en-US"/>
+        </w:rPr>
+        <w:drawing>
+          <wp:inline distT="0" distB="0" distL="0" distR="0" wp14:anchorId="64FA9814" wp14:editId="7CA9191E">
+            <wp:extent cx="114300" cy="114300"/>
+            <wp:effectExtent l="0" t="0" r="0" b="0"/>
+            <wp:docPr id="182581426" name="Graphic 1" descr="Checkmark with solid fill"/>
+            <wp:cNvGraphicFramePr>
+              <a:graphicFrameLocks xmlns:a="http://schemas.openxmlformats.org/drawingml/2006/main" noChangeAspect="1"/>
+            </wp:cNvGraphicFramePr>
+            <a:graphic xmlns:a="http://schemas.openxmlformats.org/drawingml/2006/main">
+              <a:graphicData uri="http://schemas.openxmlformats.org/drawingml/2006/picture">
+                <pic:pic xmlns:pic="http://schemas.openxmlformats.org/drawingml/2006/picture">
+                  <pic:nvPicPr>
+                    <pic:cNvPr id="169141003" name="Graphic 169141003" descr="Checkmark with solid fill"/>
+                    <pic:cNvPicPr/>
+                  </pic:nvPicPr>
+                  <pic:blipFill>
+                    <a:blip r:embed="rId7">
+                      <a:extLst>
+                        <a:ext uri="{96DAC541-7B7A-43D3-8B79-37D633B846F1}">
+                          <asvg:svgBlip xmlns:asvg="http://schemas.microsoft.com/office/drawing/2016/SVG/main" r:embed="rId8"/>
+                        </a:ext>
+                      </a:extLst>
+                    </a:blip>
+                    <a:stretch>
+                      <a:fillRect/>
+                    </a:stretch>
+                  </pic:blipFill>
+                  <pic:spPr>
+                    <a:xfrm>
+                      <a:off x="0" y="0"/>
+                      <a:ext cx="114300" cy="114300"/>
+                    </a:xfrm>
+                    <a:prstGeom prst="rect">
+                      <a:avLst/>
+                    </a:prstGeom>
+                  </pic:spPr>
+                </pic:pic>
+              </a:graphicData>
+            </a:graphic>
+          </wp:inline>
+        </w:drawing>
+      </w:r>
     </w:p>
     <w:p>
       <w:pPr>
@@ -491,21 +907,11 @@
           <w:lang w:val="en-US"/>
         </w:rPr>
       </w:pPr>
-      <w:proofErr w:type="spellStart"/>
-      <w:proofErr w:type="gramStart"/>
-      <w:r>
-        <w:rPr>
-          <w:lang w:val="en-US"/>
-        </w:rPr>
-        <w:t>Java.lang.Object</w:t>
-      </w:r>
-      <w:proofErr w:type="spellEnd"/>
-      <w:proofErr w:type="gramEnd"/>
-      <w:r>
-        <w:rPr>
-          <w:lang w:val="en-US"/>
-        </w:rPr>
-        <w:t xml:space="preserve"> </w:t>
+      <w:r>
+        <w:rPr>
+          <w:lang w:val="en-US"/>
+        </w:rPr>
+        <w:t xml:space="preserve">Java.lang.Object </w:t>
       </w:r>
     </w:p>
     <w:p>
@@ -525,6 +931,52 @@
         </w:rPr>
         <w:t>OOPS</w:t>
       </w:r>
+      <w:r>
+        <w:rPr>
+          <w:lang w:val="en-US"/>
+        </w:rPr>
+        <w:t xml:space="preserve">  </w:t>
+      </w:r>
+      <w:r>
+        <w:rPr>
+          <w:noProof/>
+        </w:rPr>
+        <w:drawing>
+          <wp:inline distT="0" distB="0" distL="0" distR="0" wp14:anchorId="6B8E9B50" wp14:editId="58E94452">
+            <wp:extent cx="114286" cy="114286"/>
+            <wp:effectExtent l="0" t="0" r="635" b="635"/>
+            <wp:docPr id="1702172711" name="Picture 1"/>
+            <wp:cNvGraphicFramePr>
+              <a:graphicFrameLocks xmlns:a="http://schemas.openxmlformats.org/drawingml/2006/main" noChangeAspect="1"/>
+            </wp:cNvGraphicFramePr>
+            <a:graphic xmlns:a="http://schemas.openxmlformats.org/drawingml/2006/main">
+              <a:graphicData uri="http://schemas.openxmlformats.org/drawingml/2006/picture">
+                <pic:pic xmlns:pic="http://schemas.openxmlformats.org/drawingml/2006/picture">
+                  <pic:nvPicPr>
+                    <pic:cNvPr id="2042517815" name=""/>
+                    <pic:cNvPicPr/>
+                  </pic:nvPicPr>
+                  <pic:blipFill>
+                    <a:blip r:embed="rId9"/>
+                    <a:stretch>
+                      <a:fillRect/>
+                    </a:stretch>
+                  </pic:blipFill>
+                  <pic:spPr>
+                    <a:xfrm>
+                      <a:off x="0" y="0"/>
+                      <a:ext cx="114286" cy="114286"/>
+                    </a:xfrm>
+                    <a:prstGeom prst="rect">
+                      <a:avLst/>
+                    </a:prstGeom>
+                  </pic:spPr>
+                </pic:pic>
+              </a:graphicData>
+            </a:graphic>
+          </wp:inline>
+        </w:drawing>
+      </w:r>
     </w:p>
     <w:p>
       <w:pPr>
@@ -543,6 +995,52 @@
         </w:rPr>
         <w:t>Encapsulation</w:t>
       </w:r>
+      <w:r>
+        <w:rPr>
+          <w:lang w:val="en-US"/>
+        </w:rPr>
+        <w:t xml:space="preserve"> </w:t>
+      </w:r>
+      <w:r>
+        <w:rPr>
+          <w:noProof/>
+        </w:rPr>
+        <w:drawing>
+          <wp:inline distT="0" distB="0" distL="0" distR="0" wp14:anchorId="4A9DEE3E" wp14:editId="27C9ADFF">
+            <wp:extent cx="114286" cy="114286"/>
+            <wp:effectExtent l="0" t="0" r="635" b="635"/>
+            <wp:docPr id="68440985" name="Picture 1"/>
+            <wp:cNvGraphicFramePr>
+              <a:graphicFrameLocks xmlns:a="http://schemas.openxmlformats.org/drawingml/2006/main" noChangeAspect="1"/>
+            </wp:cNvGraphicFramePr>
+            <a:graphic xmlns:a="http://schemas.openxmlformats.org/drawingml/2006/main">
+              <a:graphicData uri="http://schemas.openxmlformats.org/drawingml/2006/picture">
+                <pic:pic xmlns:pic="http://schemas.openxmlformats.org/drawingml/2006/picture">
+                  <pic:nvPicPr>
+                    <pic:cNvPr id="2042517815" name=""/>
+                    <pic:cNvPicPr/>
+                  </pic:nvPicPr>
+                  <pic:blipFill>
+                    <a:blip r:embed="rId9"/>
+                    <a:stretch>
+                      <a:fillRect/>
+                    </a:stretch>
+                  </pic:blipFill>
+                  <pic:spPr>
+                    <a:xfrm>
+                      <a:off x="0" y="0"/>
+                      <a:ext cx="114286" cy="114286"/>
+                    </a:xfrm>
+                    <a:prstGeom prst="rect">
+                      <a:avLst/>
+                    </a:prstGeom>
+                  </pic:spPr>
+                </pic:pic>
+              </a:graphicData>
+            </a:graphic>
+          </wp:inline>
+        </w:drawing>
+      </w:r>
     </w:p>
     <w:p>
       <w:pPr>
@@ -561,6 +1059,52 @@
         </w:rPr>
         <w:t>Inheritance</w:t>
       </w:r>
+      <w:r>
+        <w:rPr>
+          <w:lang w:val="en-US"/>
+        </w:rPr>
+        <w:t xml:space="preserve"> </w:t>
+      </w:r>
+      <w:r>
+        <w:rPr>
+          <w:noProof/>
+        </w:rPr>
+        <w:drawing>
+          <wp:inline distT="0" distB="0" distL="0" distR="0" wp14:anchorId="00E00DA0" wp14:editId="2E775837">
+            <wp:extent cx="114286" cy="114286"/>
+            <wp:effectExtent l="0" t="0" r="635" b="635"/>
+            <wp:docPr id="239749512" name="Picture 1"/>
+            <wp:cNvGraphicFramePr>
+              <a:graphicFrameLocks xmlns:a="http://schemas.openxmlformats.org/drawingml/2006/main" noChangeAspect="1"/>
+            </wp:cNvGraphicFramePr>
+            <a:graphic xmlns:a="http://schemas.openxmlformats.org/drawingml/2006/main">
+              <a:graphicData uri="http://schemas.openxmlformats.org/drawingml/2006/picture">
+                <pic:pic xmlns:pic="http://schemas.openxmlformats.org/drawingml/2006/picture">
+                  <pic:nvPicPr>
+                    <pic:cNvPr id="2042517815" name=""/>
+                    <pic:cNvPicPr/>
+                  </pic:nvPicPr>
+                  <pic:blipFill>
+                    <a:blip r:embed="rId9"/>
+                    <a:stretch>
+                      <a:fillRect/>
+                    </a:stretch>
+                  </pic:blipFill>
+                  <pic:spPr>
+                    <a:xfrm>
+                      <a:off x="0" y="0"/>
+                      <a:ext cx="114286" cy="114286"/>
+                    </a:xfrm>
+                    <a:prstGeom prst="rect">
+                      <a:avLst/>
+                    </a:prstGeom>
+                  </pic:spPr>
+                </pic:pic>
+              </a:graphicData>
+            </a:graphic>
+          </wp:inline>
+        </w:drawing>
+      </w:r>
     </w:p>
     <w:p>
       <w:pPr>
@@ -579,6 +1123,52 @@
         </w:rPr>
         <w:t>Polymorphism</w:t>
       </w:r>
+      <w:r>
+        <w:rPr>
+          <w:lang w:val="en-US"/>
+        </w:rPr>
+        <w:t xml:space="preserve"> </w:t>
+      </w:r>
+      <w:r>
+        <w:rPr>
+          <w:noProof/>
+        </w:rPr>
+        <w:drawing>
+          <wp:inline distT="0" distB="0" distL="0" distR="0" wp14:anchorId="2AD4DAC0" wp14:editId="42D8CD18">
+            <wp:extent cx="114286" cy="114286"/>
+            <wp:effectExtent l="0" t="0" r="635" b="635"/>
+            <wp:docPr id="1608457527" name="Picture 1"/>
+            <wp:cNvGraphicFramePr>
+              <a:graphicFrameLocks xmlns:a="http://schemas.openxmlformats.org/drawingml/2006/main" noChangeAspect="1"/>
+            </wp:cNvGraphicFramePr>
+            <a:graphic xmlns:a="http://schemas.openxmlformats.org/drawingml/2006/main">
+              <a:graphicData uri="http://schemas.openxmlformats.org/drawingml/2006/picture">
+                <pic:pic xmlns:pic="http://schemas.openxmlformats.org/drawingml/2006/picture">
+                  <pic:nvPicPr>
+                    <pic:cNvPr id="2042517815" name=""/>
+                    <pic:cNvPicPr/>
+                  </pic:nvPicPr>
+                  <pic:blipFill>
+                    <a:blip r:embed="rId9"/>
+                    <a:stretch>
+                      <a:fillRect/>
+                    </a:stretch>
+                  </pic:blipFill>
+                  <pic:spPr>
+                    <a:xfrm>
+                      <a:off x="0" y="0"/>
+                      <a:ext cx="114286" cy="114286"/>
+                    </a:xfrm>
+                    <a:prstGeom prst="rect">
+                      <a:avLst/>
+                    </a:prstGeom>
+                  </pic:spPr>
+                </pic:pic>
+              </a:graphicData>
+            </a:graphic>
+          </wp:inline>
+        </w:drawing>
+      </w:r>
     </w:p>
     <w:p>
       <w:pPr>
@@ -597,6 +1187,52 @@
         </w:rPr>
         <w:t>Abstraction</w:t>
       </w:r>
+      <w:r>
+        <w:rPr>
+          <w:lang w:val="en-US"/>
+        </w:rPr>
+        <w:t xml:space="preserve"> </w:t>
+      </w:r>
+      <w:r>
+        <w:rPr>
+          <w:noProof/>
+        </w:rPr>
+        <w:drawing>
+          <wp:inline distT="0" distB="0" distL="0" distR="0" wp14:anchorId="482F7C6E" wp14:editId="60C55DE7">
+            <wp:extent cx="114286" cy="114286"/>
+            <wp:effectExtent l="0" t="0" r="635" b="635"/>
+            <wp:docPr id="876526124" name="Picture 1"/>
+            <wp:cNvGraphicFramePr>
+              <a:graphicFrameLocks xmlns:a="http://schemas.openxmlformats.org/drawingml/2006/main" noChangeAspect="1"/>
+            </wp:cNvGraphicFramePr>
+            <a:graphic xmlns:a="http://schemas.openxmlformats.org/drawingml/2006/main">
+              <a:graphicData uri="http://schemas.openxmlformats.org/drawingml/2006/picture">
+                <pic:pic xmlns:pic="http://schemas.openxmlformats.org/drawingml/2006/picture">
+                  <pic:nvPicPr>
+                    <pic:cNvPr id="2042517815" name=""/>
+                    <pic:cNvPicPr/>
+                  </pic:nvPicPr>
+                  <pic:blipFill>
+                    <a:blip r:embed="rId9"/>
+                    <a:stretch>
+                      <a:fillRect/>
+                    </a:stretch>
+                  </pic:blipFill>
+                  <pic:spPr>
+                    <a:xfrm>
+                      <a:off x="0" y="0"/>
+                      <a:ext cx="114286" cy="114286"/>
+                    </a:xfrm>
+                    <a:prstGeom prst="rect">
+                      <a:avLst/>
+                    </a:prstGeom>
+                  </pic:spPr>
+                </pic:pic>
+              </a:graphicData>
+            </a:graphic>
+          </wp:inline>
+        </w:drawing>
+      </w:r>
     </w:p>
     <w:p>
       <w:pPr>
@@ -615,6 +1251,52 @@
         </w:rPr>
         <w:t>Constructor</w:t>
       </w:r>
+      <w:r>
+        <w:rPr>
+          <w:lang w:val="en-US"/>
+        </w:rPr>
+        <w:t xml:space="preserve"> </w:t>
+      </w:r>
+      <w:r>
+        <w:rPr>
+          <w:noProof/>
+        </w:rPr>
+        <w:drawing>
+          <wp:inline distT="0" distB="0" distL="0" distR="0" wp14:anchorId="687A4125" wp14:editId="352228A5">
+            <wp:extent cx="114286" cy="114286"/>
+            <wp:effectExtent l="0" t="0" r="635" b="635"/>
+            <wp:docPr id="661486435" name="Picture 1"/>
+            <wp:cNvGraphicFramePr>
+              <a:graphicFrameLocks xmlns:a="http://schemas.openxmlformats.org/drawingml/2006/main" noChangeAspect="1"/>
+            </wp:cNvGraphicFramePr>
+            <a:graphic xmlns:a="http://schemas.openxmlformats.org/drawingml/2006/main">
+              <a:graphicData uri="http://schemas.openxmlformats.org/drawingml/2006/picture">
+                <pic:pic xmlns:pic="http://schemas.openxmlformats.org/drawingml/2006/picture">
+                  <pic:nvPicPr>
+                    <pic:cNvPr id="2042517815" name=""/>
+                    <pic:cNvPicPr/>
+                  </pic:nvPicPr>
+                  <pic:blipFill>
+                    <a:blip r:embed="rId9"/>
+                    <a:stretch>
+                      <a:fillRect/>
+                    </a:stretch>
+                  </pic:blipFill>
+                  <pic:spPr>
+                    <a:xfrm>
+                      <a:off x="0" y="0"/>
+                      <a:ext cx="114286" cy="114286"/>
+                    </a:xfrm>
+                    <a:prstGeom prst="rect">
+                      <a:avLst/>
+                    </a:prstGeom>
+                  </pic:spPr>
+                </pic:pic>
+              </a:graphicData>
+            </a:graphic>
+          </wp:inline>
+        </w:drawing>
+      </w:r>
     </w:p>
     <w:p>
       <w:pPr>
@@ -717,19 +1399,11 @@
           <w:lang w:val="en-US"/>
         </w:rPr>
       </w:pPr>
-      <w:proofErr w:type="spellStart"/>
-      <w:r>
-        <w:rPr>
-          <w:lang w:val="en-US"/>
-        </w:rPr>
-        <w:t>StringBuffer</w:t>
-      </w:r>
-      <w:proofErr w:type="spellEnd"/>
-      <w:r>
-        <w:rPr>
-          <w:lang w:val="en-US"/>
-        </w:rPr>
-        <w:t xml:space="preserve"> class</w:t>
+      <w:r>
+        <w:rPr>
+          <w:lang w:val="en-US"/>
+        </w:rPr>
+        <w:t>StringBuffer class</w:t>
       </w:r>
     </w:p>
     <w:p>
@@ -747,21 +1421,7 @@
         <w:rPr>
           <w:lang w:val="en-US"/>
         </w:rPr>
-        <w:t xml:space="preserve">StringBuilder </w:t>
-      </w:r>
-      <w:proofErr w:type="gramStart"/>
-      <w:r>
-        <w:rPr>
-          <w:lang w:val="en-US"/>
-        </w:rPr>
-        <w:t>class(</w:t>
-      </w:r>
-      <w:proofErr w:type="gramEnd"/>
-      <w:r>
-        <w:rPr>
-          <w:lang w:val="en-US"/>
-        </w:rPr>
-        <w:t>JDK 1.5)</w:t>
+        <w:t>StringBuilder class(JDK 1.5)</w:t>
       </w:r>
     </w:p>
     <w:sectPr>

</xml_diff>